<commit_message>
Artículo completo: integrantes, docente, curso, URLs públicas y traducción
- Portada: Escuela de Ingeniería de Sistemas VII ciclo, curso Ingeniería del
  Software, docente Santos Fernández Juan Pedro, autores Castañeda Flores
  Carlos Daniel y Guzmán Limo Lizbeth Dorita Anabel con correos.
- Sección 7: la limitación de idioma ahora documenta la capa de traducción
  ES→EN de la aplicación; el punto de despliegue refleja las URLs reales.
- Anexo F: URLs públicas verificables del despliegue.
- PDF regenerado con Word (29 páginas); VALIDACION_FINAL.json actualizado.

Co-Authored-By: Claude Fable 5 <noreply@anthropic.com>
</commit_message>
<xml_diff>
--- a/reports/articulo_cientifico_reuniones_ia.docx
+++ b/reports/articulo_cientifico_reuniones_ia.docx
@@ -47,7 +47,7 @@
     </w:p>
     <w:p>
       <w:pPr>
-        <w:spacing w:before="1400"/>
+        <w:spacing w:before="900"/>
         <w:jc w:val="center"/>
       </w:pPr>
       <w:r>
@@ -55,7 +55,69 @@
           <w:rFonts w:ascii="Arial" w:hAnsi="Arial"/>
           <w:sz w:val="22"/>
         </w:rPr>
-        <w:t>Autores: Carlos Daniel Castañeda Flores y equipo de investigación</w:t>
+        <w:t xml:space="preserve">Escuela de Ingeniería de Sistemas · VII Ciclo</w:t>
+      </w:r>
+    </w:p>
+    <w:p>
+      <w:pPr>
+        <w:jc w:val="center"/>
+      </w:pPr>
+      <w:r>
+        <w:rPr>
+          <w:rFonts w:ascii="Arial" w:hAnsi="Arial"/>
+          <w:sz w:val="22"/>
+        </w:rPr>
+        <w:t xml:space="preserve">Curso: Ingeniería del Software</w:t>
+      </w:r>
+    </w:p>
+    <w:p>
+      <w:pPr>
+        <w:jc w:val="center"/>
+      </w:pPr>
+      <w:r>
+        <w:rPr>
+          <w:rFonts w:ascii="Arial" w:hAnsi="Arial"/>
+          <w:sz w:val="22"/>
+        </w:rPr>
+        <w:t xml:space="preserve">Docente: Santos Fernández Juan Pedro</w:t>
+      </w:r>
+    </w:p>
+    <w:p>
+      <w:pPr>
+        <w:spacing w:before="300"/>
+        <w:jc w:val="center"/>
+      </w:pPr>
+      <w:r>
+        <w:rPr>
+          <w:rFonts w:ascii="Arial" w:hAnsi="Arial"/>
+          <w:b/>
+          <w:sz w:val="22"/>
+        </w:rPr>
+        <w:t xml:space="preserve">Autores:</w:t>
+      </w:r>
+    </w:p>
+    <w:p>
+      <w:pPr>
+        <w:jc w:val="center"/>
+      </w:pPr>
+      <w:r>
+        <w:rPr>
+          <w:rFonts w:ascii="Arial" w:hAnsi="Arial"/>
+          <w:sz w:val="22"/>
+        </w:rPr>
+        <w:t xml:space="preserve">Castañeda Flores, Carlos Daniel — cdcastanedafl@unitru.edu.pe</w:t>
+      </w:r>
+    </w:p>
+    <w:p>
+      <w:pPr>
+        <w:jc w:val="center"/>
+      </w:pPr>
+      <w:r>
+        <w:rPr>
+          <w:rFonts w:ascii="Arial" w:hAnsi="Arial"/>
+          <w:sz w:val="22"/>
+        </w:rPr>
+        <w:t xml:space="preserve">Guzmán Limo, Lizbeth Dorita Anabel — ldguzmanli@unitru.edu.pe</w:t>
       </w:r>
     </w:p>
     <w:p>
@@ -5960,7 +6022,7 @@
         <w:spacing w:after="40"/>
       </w:pPr>
       <w:r>
-        <w:t>El corpus está en inglés, mientras que la interfaz de gestión está en español. No debe asumirse el mismo desempeño con transcripciones en español.</w:t>
+        <w:t>El corpus está en inglés, mientras que la interfaz de gestión está en español. No debe asumirse el mismo desempeño con transcripciones en español. Para el uso práctico, la aplicación desplegada incorpora una capa de traducción automática español→inglés previa a la predicción, declarada en la propia interfaz; como trabajo futuro se propone el reentrenamiento con un corpus de actos de diálogo en español (por ejemplo, DIHANA).</w:t>
       </w:r>
     </w:p>
     <w:p>
@@ -5996,7 +6058,7 @@
         <w:spacing w:after="40"/>
       </w:pPr>
       <w:r>
-        <w:t>La publicación en Render, Vercel, GitHub y Jira requiere credenciales y autorización de las cuentas del equipo; los archivos de despliegue e importación están preparados, pero no se afirma una URL pública inexistente.</w:t>
+        <w:t>El sistema fue desplegado públicamente el 12 de julio de 2026 con las cuentas del equipo: API FastAPI en Render (https://reuniones-ia-api.onrender.com), frontend Streamlit en Render (https://reuniones-ia-frontend.onrender.com), landing en Vercel (https://reuniones-ia-articulo.vercel.app), código con integración continua y release v1.0.0 en GitHub (https://github.com/lizbethGuzman16/reuniones-ia-articulo) y gestión del proyecto en Jira (proyecto RIA). Los servicios usan planes gratuitos, por lo que la primera petición tras un periodo de inactividad puede tardar hasta dos minutos.</w:t>
       </w:r>
     </w:p>
     <w:p>
@@ -8359,6 +8421,11 @@
       </w:r>
     </w:p>
     <w:p>
+      <w:r>
+        <w:t xml:space="preserve">Adicionalmente, el sistema quedó desplegado públicamente y puede verificarse en línea: API https://reuniones-ia-api.onrender.com (salud en /health, documentación en /docs), aplicación https://reuniones-ia-frontend.onrender.com, landing https://reuniones-ia-articulo.vercel.app y repositorio https://github.com/lizbethGuzman16/reuniones-ia-articulo (release v1.0.0 con los reportes adjuntos).</w:t>
+      </w:r>
+    </w:p>
+    <w:p>
       <w:pPr>
         <w:keepNext/>
         <w:jc w:val="center"/>

</xml_diff>

<commit_message>
Entrenar y documentar seis modelos reales
</commit_message>
<xml_diff>
--- a/reports/articulo_cientifico_reuniones_ia.docx
+++ b/reports/articulo_cientifico_reuniones_ia.docx
@@ -260,7 +260,7 @@
         <w:ind w:firstLine="425"/>
       </w:pPr>
       <w:r>
-        <w:t>La investigación evaluó cinco arquitecturas neuronales para clasificar automáticamente actos de diálogo en transcripciones de reuniones. Se utilizó el conjunto público ICSI Meeting Recorder Dialogue Act (MRDA), distribuido mediante el benchmark SILICONE, con 109 228 intervenciones, 73 reuniones y 52 hablantes. El proceso incluyó limpieza, análisis exploratorio, entrenamiento de tres modelos clásicos (MLP con TF-IDF, CNN-1D y LSTM) y dos modelos híbridos (CNN-BiLSTM y BiLSTM con atención), evaluación sobre la partición oficial de prueba, validación cruzada estratificada por grupos con cinco folds, ajuste de hiperparámetros y pruebas no paramétricas. El mejor desempeño en prueba correspondió a MLP-TFIDF, con accuracy de 0,6427, F1 macro de 0,6219 y AUC ROC macro de 0,8896. En validación cruzada, CNN-1D presentó el mayor F1 macro promedio (0,4982) y la menor variación entre los modelos recurrentes e híbridos comparados. La prueba de Friedman identificó diferencias globales significativas (χ²=17,28; p=0,0017), aunque las comparaciones pareadas de Wilcoxon con corrección de Holm no resultaron significativas, debido a la limitada potencia estadística de cinco folds. El mejor modelo se persistió en formato HDF5 (.h5) y se integró en una API FastAPI y un dashboard autenticado en Streamlit, con exportación de reportes a PDF, Word y Excel. Los resultados constituyen una línea base reproducible, no un resultado de estado del arte, y muestran la viabilidad de incorporar clasificación de intenciones en un sistema de gestión de reuniones.</w:t>
+        <w:t>La investigación evaluó seis arquitecturas neuronales para clasificar automáticamente actos de diálogo en transcripciones de reuniones. Se utilizó el conjunto público ICSI Meeting Recorder Dialogue Act (MRDA), distribuido mediante el benchmark SILICONE, con 109 228 intervenciones, 73 reuniones y 52 hablantes. El proceso incluyó limpieza, análisis exploratorio, entrenamiento de tres modelos base (CNN-1D, LSTM y BiLSTM) y tres modelos híbridos (MLP con TF-IDF, CNN-BiLSTM y BiLSTM con atención), evaluación sobre la partición oficial de prueba, validación cruzada estratificada por grupos con cinco folds sobre el conjunto original de cinco modelos, ajuste de hiperparámetros y pruebas no paramétricas. El mejor desempeño en prueba correspondió a MLP-TFIDF, con accuracy de 0,6427, F1 macro de 0,6219 y AUC ROC macro de 0,8896. En validación cruzada, CNN-1D presentó el mayor F1 macro promedio (0,4982). La prueba de Friedman identificó diferencias globales significativas (χ²=17,28; p=0,0017), aunque las comparaciones pareadas de Wilcoxon con corrección de Holm no resultaron significativas, debido a la limitada potencia estadística de cinco folds. El mejor modelo se persistió en formato HDF5 (.h5) y se integró en una API FastAPI y un dashboard autenticado en Streamlit, con exportación de reportes a PDF, Word y Excel. Los resultados constituyen una línea base reproducible, no un resultado de estado del arte, y muestran la viabilidad de incorporar clasificación de intenciones en un sistema de gestión de reuniones.</w:t>
       </w:r>
     </w:p>
     <w:p>
@@ -290,7 +290,7 @@
         <w:ind w:firstLine="425"/>
       </w:pPr>
       <w:r>
-        <w:t>This study evaluated five neural architectures for automatic dialogue-act classification in meeting transcripts. The public ICSI Meeting Recorder Dialogue Act (MRDA) dataset distributed through SILICONE was used, comprising 109,228 utterances, 73 meetings, and 52 speakers. The workflow included cleaning, exploratory data analysis, training of three classical models (TF-IDF MLP, 1D CNN, and LSTM) and two hybrid models (CNN-BiLSTM and attention-based BiLSTM), evaluation on the official test split, five-fold stratified group cross-validation, hyperparameter tuning, and non-parametric statistical testing. TF-IDF MLP achieved the best test performance (accuracy 0.6427, macro-F1 0.6219, macro ROC-AUC 0.8896). CNN-1D showed the highest mean macro-F1 in cross-validation (0.4982). Friedman’s test detected overall differences (χ²=17.28; p=0.0017), whereas Holm-adjusted Wilcoxon pairwise comparisons were not significant. The selected model was saved as an HDF5 artifact and integrated into FastAPI and an authenticated Streamlit dashboard. The results provide a reproducible baseline rather than a state-of-the-art claim.</w:t>
+        <w:t>This study evaluated six neural architectures for automatic dialogue-act classification in meeting transcripts. The public ICSI Meeting Recorder Dialogue Act (MRDA) dataset distributed through SILICONE was used, comprising 109,228 utterances, 73 meetings, and 52 speakers. The workflow included cleaning, exploratory data analysis, training of three base models (1D CNN, LSTM, and BiLSTM) and three hybrid models (TF-IDF MLP, CNN-BiLSTM, and attention-based BiLSTM), evaluation on the official test split, and five-fold stratified group cross-validation on the original five-model subset, hyperparameter tuning, and non-parametric statistical testing. TF-IDF MLP achieved the best test performance (accuracy 0.6427, macro-F1 0.6219, macro ROC-AUC 0.8896). CNN-1D showed the highest mean macro-F1 in cross-validation (0.4982). Friedman’s test detected overall differences (χ²=17.28; p=0.0017), whereas Holm-adjusted Wilcoxon pairwise comparisons were not significant. The selected model was saved as an HDF5 artifact and integrated into FastAPI and an authenticated Streamlit dashboard. The results provide a reproducible baseline rather than a state-of-the-art claim.</w:t>
       </w:r>
     </w:p>
     <w:p>
@@ -340,7 +340,7 @@
         <w:ind w:firstLine="425"/>
       </w:pPr>
       <w:r>
-        <w:t>El sistema base asignado al equipo ya gestionaba usuarios, reuniones, participantes, tareas, resúmenes y métricas mediante Streamlit, Supabase y automatizaciones n8n. No obstante, el consumo de un modelo generativo externo no constituía por sí mismo un experimento científico entrenado con datos públicos. Por ello, esta investigación incorporó un módulo de aprendizaje supervisado evaluado con cinco arquitecturas, reportes comparativos y pruebas estadísticas.</w:t>
+        <w:t>El sistema base asignado al equipo ya gestionaba usuarios, reuniones, participantes, tareas, resúmenes y métricas mediante Streamlit, Supabase y automatizaciones n8n. No obstante, el consumo de un modelo generativo externo no constituía por sí mismo un experimento científico entrenado con datos públicos. Por ello, esta investigación incorporó un módulo de aprendizaje supervisado evaluado con seis arquitecturas, reportes comparativos y pruebas estadísticas.</w:t>
       </w:r>
     </w:p>
     <w:p>
@@ -359,7 +359,7 @@
         <w:ind w:firstLine="425"/>
       </w:pPr>
       <w:r>
-        <w:t>¿Qué arquitectura neuronal, entre tres modelos clásicos y dos modelos híbridos, ofrece el mejor equilibrio entre F1 macro, capacidad discriminativa, tiempo de procesamiento y estabilidad para clasificar actos de diálogo en transcripciones de reuniones del corpus público MRDA?</w:t>
+        <w:t>¿Qué arquitectura neuronal, entre tres modelos base y tres modelos híbridos, ofrece el mejor equilibrio entre F1 macro, capacidad discriminativa, tiempo de procesamiento y estabilidad para clasificar actos de diálogo en transcripciones de reuniones del corpus público MRDA?</w:t>
       </w:r>
     </w:p>
     <w:p>
@@ -378,7 +378,7 @@
         <w:ind w:firstLine="425"/>
       </w:pPr>
       <w:r>
-        <w:t>Comparar cinco arquitecturas neuronales para la clasificación de actos de diálogo en reuniones, utilizando el corpus público MRDA y una plataforma integrada con Streamlit y FastAPI.</w:t>
+        <w:t>Comparar seis arquitecturas neuronales para la clasificación de actos de diálogo en reuniones, utilizando el corpus público MRDA y una plataforma integrada con Streamlit y FastAPI.</w:t>
       </w:r>
     </w:p>
     <w:p>
@@ -405,7 +405,7 @@
         <w:spacing w:after="40"/>
       </w:pPr>
       <w:r>
-        <w:t>Entrenar tres modelos clásicos: MLP-TFIDF, CNN-1D y LSTM.</w:t>
+        <w:t>Entrenar tres modelos base: CNN-1D, LSTM y BiLSTM.</w:t>
       </w:r>
     </w:p>
     <w:p>
@@ -414,7 +414,7 @@
         <w:spacing w:after="40"/>
       </w:pPr>
       <w:r>
-        <w:t>Entrenar dos modelos híbridos: CNN-BiLSTM y BiLSTM con mecanismo de atención.</w:t>
+        <w:t>Entrenar tres modelos híbridos: MLP-TFIDF, CNN-BiLSTM y BiLSTM con mecanismo de atención.</w:t>
       </w:r>
     </w:p>
     <w:p>
@@ -469,7 +469,7 @@
         <w:ind w:firstLine="425"/>
       </w:pPr>
       <w:r>
-        <w:t>H1: existe al menos una diferencia estadísticamente significativa en el F1 macro obtenido por las cinco arquitecturas evaluadas mediante validación cruzada. H0: no existen diferencias significativas entre sus distribuciones de F1 macro.</w:t>
+        <w:t>H1: existe al menos una diferencia estadísticamente significativa en el F1 macro obtenido por las cinco arquitecturas incluidas en la validación cruzada. H0: no existen diferencias significativas entre sus distribuciones de F1 macro.</w:t>
       </w:r>
     </w:p>
     <w:p>
@@ -516,7 +516,7 @@
         <w:ind w:firstLine="425"/>
       </w:pPr>
       <w:r>
-        <w:t>MLP-TFIDF representa cada intervención con ponderaciones término-frecuencia/inversa de frecuencia documental y utiliza una red multicapa. CNN-1D aprende filtros sobre secuencias de tokens y captura patrones locales. LSTM modela dependencias secuenciales mediante memoria y compuertas. CNN-BiLSTM combina detección local con contexto bidireccional. BiLSTM con atención pondera estados ocultos para concentrar la decisión en fragmentos informativos. Estas familias se sustentan en trabajos clásicos de Kim (2014), Hochreiter y Schmidhuber (1997), Schuster y Paliwal (1997) y Bahdanau et al. (2015).</w:t>
+        <w:t>MLP-TFIDF combina representaciones término-frecuencia/inversa de frecuencia documental con una red multicapa. CNN-1D aprende filtros sobre secuencias de tokens y captura patrones locales. LSTM modela dependencias secuenciales mediante memoria y compuertas. BiLSTM procesa el texto en ambos sentidos. CNN-BiLSTM combina detección local con contexto bidireccional. BiLSTM con atención pondera estados ocultos para concentrar la decisión en fragmentos informativos. Estas familias se sustentan en trabajos clásicos de Kim (2014), Hochreiter y Schmidhuber (1997), Schuster y Paliwal (1997) y Bahdanau et al. (2015).</w:t>
       </w:r>
     </w:p>
     <w:p>
@@ -951,7 +951,9 @@
             <w:pPr>
               <w:jc w:val="center"/>
             </w:pPr>
-            <w:r/>
+            <w:r>
+              <w:t>Modelo</w:t>
+            </w:r>
             <w:r>
               <w:rPr>
                 <w:rFonts w:ascii="Arial" w:hAnsi="Arial"/>
@@ -959,7 +961,6 @@
                 <w:color w:val="FFFFFF"/>
                 <w:sz w:val="15"/>
               </w:rPr>
-              <w:t>Modelo</w:t>
             </w:r>
           </w:p>
         </w:tc>
@@ -973,7 +974,9 @@
             <w:pPr>
               <w:jc w:val="center"/>
             </w:pPr>
-            <w:r/>
+            <w:r>
+              <w:t>Categoría</w:t>
+            </w:r>
             <w:r>
               <w:rPr>
                 <w:rFonts w:ascii="Arial" w:hAnsi="Arial"/>
@@ -981,7 +984,6 @@
                 <w:color w:val="FFFFFF"/>
                 <w:sz w:val="15"/>
               </w:rPr>
-              <w:t>Categoría</w:t>
             </w:r>
           </w:p>
         </w:tc>
@@ -995,7 +997,9 @@
             <w:pPr>
               <w:jc w:val="center"/>
             </w:pPr>
-            <w:r/>
+            <w:r>
+              <w:t>Estructura general</w:t>
+            </w:r>
             <w:r>
               <w:rPr>
                 <w:rFonts w:ascii="Arial" w:hAnsi="Arial"/>
@@ -1003,7 +1007,6 @@
                 <w:color w:val="FFFFFF"/>
                 <w:sz w:val="15"/>
               </w:rPr>
-              <w:t>Estructura general</w:t>
             </w:r>
           </w:p>
         </w:tc>
@@ -1018,14 +1021,15 @@
             <w:pPr>
               <w:jc w:val="left"/>
             </w:pPr>
-            <w:r/>
+            <w:r>
+              <w:t>CNN-1D</w:t>
+            </w:r>
             <w:r>
               <w:rPr>
                 <w:rFonts w:ascii="Arial" w:hAnsi="Arial"/>
                 <w:b w:val="0"/>
                 <w:sz w:val="15"/>
               </w:rPr>
-              <w:t>MLP-TFIDF</w:t>
             </w:r>
           </w:p>
         </w:tc>
@@ -1038,14 +1042,15 @@
             <w:pPr>
               <w:jc w:val="center"/>
             </w:pPr>
-            <w:r/>
+            <w:r>
+              <w:t>Base</w:t>
+            </w:r>
             <w:r>
               <w:rPr>
                 <w:rFonts w:ascii="Arial" w:hAnsi="Arial"/>
                 <w:b w:val="0"/>
                 <w:sz w:val="15"/>
               </w:rPr>
-              <w:t>Clásico</w:t>
             </w:r>
           </w:p>
         </w:tc>
@@ -1058,14 +1063,15 @@
             <w:pPr>
               <w:jc w:val="center"/>
             </w:pPr>
-            <w:r/>
+            <w:r>
+              <w:t>Embedding → convolución 1D → pooling global → 5 clases</w:t>
+            </w:r>
             <w:r>
               <w:rPr>
                 <w:rFonts w:ascii="Arial" w:hAnsi="Arial"/>
                 <w:b w:val="0"/>
                 <w:sz w:val="15"/>
               </w:rPr>
-              <w:t>TF-IDF 2 500 → capas densas → 5 clases</w:t>
             </w:r>
           </w:p>
         </w:tc>
@@ -1081,14 +1087,15 @@
             <w:pPr>
               <w:jc w:val="left"/>
             </w:pPr>
-            <w:r/>
+            <w:r>
+              <w:t>LSTM</w:t>
+            </w:r>
             <w:r>
               <w:rPr>
                 <w:rFonts w:ascii="Arial" w:hAnsi="Arial"/>
                 <w:b w:val="0"/>
                 <w:sz w:val="15"/>
               </w:rPr>
-              <w:t>CNN-1D</w:t>
             </w:r>
           </w:p>
         </w:tc>
@@ -1102,14 +1109,15 @@
             <w:pPr>
               <w:jc w:val="center"/>
             </w:pPr>
-            <w:r/>
+            <w:r>
+              <w:t>Base</w:t>
+            </w:r>
             <w:r>
               <w:rPr>
                 <w:rFonts w:ascii="Arial" w:hAnsi="Arial"/>
                 <w:b w:val="0"/>
                 <w:sz w:val="15"/>
               </w:rPr>
-              <w:t>Clásico</w:t>
             </w:r>
           </w:p>
         </w:tc>
@@ -1123,14 +1131,15 @@
             <w:pPr>
               <w:jc w:val="center"/>
             </w:pPr>
-            <w:r/>
+            <w:r>
+              <w:t>Embedding → LSTM → capa densa → 5 clases</w:t>
+            </w:r>
             <w:r>
               <w:rPr>
                 <w:rFonts w:ascii="Arial" w:hAnsi="Arial"/>
                 <w:b w:val="0"/>
                 <w:sz w:val="15"/>
               </w:rPr>
-              <w:t>Embedding → convolución 1D → pooling global → 5 clases</w:t>
             </w:r>
           </w:p>
         </w:tc>
@@ -1145,14 +1154,15 @@
             <w:pPr>
               <w:jc w:val="left"/>
             </w:pPr>
-            <w:r/>
+            <w:r>
+              <w:t>BiLSTM</w:t>
+            </w:r>
             <w:r>
               <w:rPr>
                 <w:rFonts w:ascii="Arial" w:hAnsi="Arial"/>
                 <w:b w:val="0"/>
                 <w:sz w:val="15"/>
               </w:rPr>
-              <w:t>LSTM</w:t>
             </w:r>
           </w:p>
         </w:tc>
@@ -1165,14 +1175,15 @@
             <w:pPr>
               <w:jc w:val="center"/>
             </w:pPr>
-            <w:r/>
+            <w:r>
+              <w:t>Base</w:t>
+            </w:r>
             <w:r>
               <w:rPr>
                 <w:rFonts w:ascii="Arial" w:hAnsi="Arial"/>
                 <w:b w:val="0"/>
                 <w:sz w:val="15"/>
               </w:rPr>
-              <w:t>Clásico</w:t>
             </w:r>
           </w:p>
         </w:tc>
@@ -1185,14 +1196,15 @@
             <w:pPr>
               <w:jc w:val="center"/>
             </w:pPr>
-            <w:r/>
+            <w:r>
+              <w:t>Embedding → BiLSTM → capa densa → 5 clases</w:t>
+            </w:r>
             <w:r>
               <w:rPr>
                 <w:rFonts w:ascii="Arial" w:hAnsi="Arial"/>
                 <w:b w:val="0"/>
                 <w:sz w:val="15"/>
               </w:rPr>
-              <w:t>Embedding → LSTM → capa densa → 5 clases</w:t>
             </w:r>
           </w:p>
         </w:tc>
@@ -1208,14 +1220,15 @@
             <w:pPr>
               <w:jc w:val="left"/>
             </w:pPr>
-            <w:r/>
+            <w:r>
+              <w:t>MLP-TFIDF</w:t>
+            </w:r>
             <w:r>
               <w:rPr>
                 <w:rFonts w:ascii="Arial" w:hAnsi="Arial"/>
                 <w:b w:val="0"/>
                 <w:sz w:val="15"/>
               </w:rPr>
-              <w:t>CNN-BiLSTM</w:t>
             </w:r>
           </w:p>
         </w:tc>
@@ -1229,14 +1242,15 @@
             <w:pPr>
               <w:jc w:val="center"/>
             </w:pPr>
-            <w:r/>
+            <w:r>
+              <w:t>Híbrido</w:t>
+            </w:r>
             <w:r>
               <w:rPr>
                 <w:rFonts w:ascii="Arial" w:hAnsi="Arial"/>
                 <w:b w:val="0"/>
                 <w:sz w:val="15"/>
               </w:rPr>
-              <w:t>Híbrido</w:t>
             </w:r>
           </w:p>
         </w:tc>
@@ -1250,14 +1264,15 @@
             <w:pPr>
               <w:jc w:val="center"/>
             </w:pPr>
-            <w:r/>
+            <w:r>
+              <w:t>TF-IDF 2 500 → capas densas → 5 clases</w:t>
+            </w:r>
             <w:r>
               <w:rPr>
                 <w:rFonts w:ascii="Arial" w:hAnsi="Arial"/>
                 <w:b w:val="0"/>
                 <w:sz w:val="15"/>
               </w:rPr>
-              <w:t>Embedding → CNN-1D → BiLSTM → capa densa</w:t>
             </w:r>
           </w:p>
         </w:tc>
@@ -1272,14 +1287,15 @@
             <w:pPr>
               <w:jc w:val="left"/>
             </w:pPr>
-            <w:r/>
+            <w:r>
+              <w:t>CNN-BiLSTM</w:t>
+            </w:r>
             <w:r>
               <w:rPr>
                 <w:rFonts w:ascii="Arial" w:hAnsi="Arial"/>
                 <w:b w:val="0"/>
                 <w:sz w:val="15"/>
               </w:rPr>
-              <w:t>BiLSTM-Atención</w:t>
             </w:r>
           </w:p>
         </w:tc>
@@ -1292,14 +1308,15 @@
             <w:pPr>
               <w:jc w:val="center"/>
             </w:pPr>
-            <w:r/>
+            <w:r>
+              <w:t>Híbrido</w:t>
+            </w:r>
             <w:r>
               <w:rPr>
                 <w:rFonts w:ascii="Arial" w:hAnsi="Arial"/>
                 <w:b w:val="0"/>
                 <w:sz w:val="15"/>
               </w:rPr>
-              <w:t>Híbrido</w:t>
             </w:r>
           </w:p>
         </w:tc>
@@ -1312,14 +1329,80 @@
             <w:pPr>
               <w:jc w:val="center"/>
             </w:pPr>
-            <w:r/>
+            <w:r>
+              <w:t>Embedding → CNN-1D → BiLSTM → capa densa</w:t>
+            </w:r>
             <w:r>
               <w:rPr>
                 <w:rFonts w:ascii="Arial" w:hAnsi="Arial"/>
                 <w:b w:val="0"/>
                 <w:sz w:val="15"/>
               </w:rPr>
+            </w:r>
+          </w:p>
+        </w:tc>
+      </w:tr>
+      <w:tr>
+        <w:tc>
+          <w:tcPr>
+            <w:tcW w:type="dxa" w:w="3267"/>
+            <w:vAlign w:val="center"/>
+          </w:tcPr>
+          <w:p>
+            <w:pPr>
+              <w:jc w:val="left"/>
+            </w:pPr>
+            <w:r>
+              <w:t>BiLSTM-Atención</w:t>
+            </w:r>
+            <w:r>
+              <w:rPr>
+                <w:rFonts w:ascii="Arial" w:hAnsi="Arial"/>
+                <w:b w:val="0"/>
+                <w:sz w:val="15"/>
+              </w:rPr>
+            </w:r>
+          </w:p>
+        </w:tc>
+        <w:tc>
+          <w:tcPr>
+            <w:tcW w:type="dxa" w:w="3267"/>
+            <w:vAlign w:val="center"/>
+          </w:tcPr>
+          <w:p>
+            <w:pPr>
+              <w:jc w:val="center"/>
+            </w:pPr>
+            <w:r>
+              <w:t>Híbrido</w:t>
+            </w:r>
+            <w:r>
+              <w:rPr>
+                <w:rFonts w:ascii="Arial" w:hAnsi="Arial"/>
+                <w:b w:val="0"/>
+                <w:sz w:val="15"/>
+              </w:rPr>
+            </w:r>
+          </w:p>
+        </w:tc>
+        <w:tc>
+          <w:tcPr>
+            <w:tcW w:type="dxa" w:w="3267"/>
+            <w:vAlign w:val="center"/>
+          </w:tcPr>
+          <w:p>
+            <w:pPr>
+              <w:jc w:val="center"/>
+            </w:pPr>
+            <w:r>
               <w:t>Embedding → BiLSTM → atención → capa densa</w:t>
+            </w:r>
+            <w:r>
+              <w:rPr>
+                <w:rFonts w:ascii="Arial" w:hAnsi="Arial"/>
+                <w:b w:val="0"/>
+                <w:sz w:val="15"/>
+              </w:rPr>
             </w:r>
           </w:p>
         </w:tc>
@@ -1342,7 +1425,7 @@
           <w:i/>
           <w:sz w:val="17"/>
         </w:rPr>
-        <w:t>Tabla 2. Modelos clásicos e híbridos evaluados.</w:t>
+        <w:t>Tabla 2. Tres modelos base y tres modelos híbridos evaluados.</w:t>
       </w:r>
     </w:p>
     <w:p>
@@ -2503,7 +2586,7 @@
         <w:keepNext/>
       </w:pPr>
       <w:r>
-        <w:t>4.2 Comparación de los cinco modelos</w:t>
+        <w:t>4.2 Comparación de los seis modelos</w:t>
       </w:r>
     </w:p>
     <w:tbl>
@@ -2536,7 +2619,9 @@
             <w:pPr>
               <w:jc w:val="center"/>
             </w:pPr>
-            <w:r/>
+            <w:r>
+              <w:t>Modelo</w:t>
+            </w:r>
             <w:r>
               <w:rPr>
                 <w:rFonts w:ascii="Arial" w:hAnsi="Arial"/>
@@ -2544,7 +2629,6 @@
                 <w:color w:val="FFFFFF"/>
                 <w:sz w:val="13"/>
               </w:rPr>
-              <w:t>Modelo</w:t>
             </w:r>
           </w:p>
         </w:tc>
@@ -2558,7 +2642,9 @@
             <w:pPr>
               <w:jc w:val="center"/>
             </w:pPr>
-            <w:r/>
+            <w:r>
+              <w:t>Accuracy</w:t>
+            </w:r>
             <w:r>
               <w:rPr>
                 <w:rFonts w:ascii="Arial" w:hAnsi="Arial"/>
@@ -2566,7 +2652,6 @@
                 <w:color w:val="FFFFFF"/>
                 <w:sz w:val="13"/>
               </w:rPr>
-              <w:t>Accuracy</w:t>
             </w:r>
           </w:p>
         </w:tc>
@@ -2580,7 +2665,9 @@
             <w:pPr>
               <w:jc w:val="center"/>
             </w:pPr>
-            <w:r/>
+            <w:r>
+              <w:t>F1 macro</w:t>
+            </w:r>
             <w:r>
               <w:rPr>
                 <w:rFonts w:ascii="Arial" w:hAnsi="Arial"/>
@@ -2588,7 +2675,6 @@
                 <w:color w:val="FFFFFF"/>
                 <w:sz w:val="13"/>
               </w:rPr>
-              <w:t>F1 macro</w:t>
             </w:r>
           </w:p>
         </w:tc>
@@ -2602,7 +2688,9 @@
             <w:pPr>
               <w:jc w:val="center"/>
             </w:pPr>
-            <w:r/>
+            <w:r>
+              <w:t>ROC-AUC</w:t>
+            </w:r>
             <w:r>
               <w:rPr>
                 <w:rFonts w:ascii="Arial" w:hAnsi="Arial"/>
@@ -2610,7 +2698,6 @@
                 <w:color w:val="FFFFFF"/>
                 <w:sz w:val="13"/>
               </w:rPr>
-              <w:t>ROC-AUC</w:t>
             </w:r>
           </w:p>
         </w:tc>
@@ -2624,7 +2711,9 @@
             <w:pPr>
               <w:jc w:val="center"/>
             </w:pPr>
-            <w:r/>
+            <w:r>
+              <w:t>Entren. (s)</w:t>
+            </w:r>
             <w:r>
               <w:rPr>
                 <w:rFonts w:ascii="Arial" w:hAnsi="Arial"/>
@@ -2632,7 +2721,6 @@
                 <w:color w:val="FFFFFF"/>
                 <w:sz w:val="13"/>
               </w:rPr>
-              <w:t>Entren. (s)</w:t>
             </w:r>
           </w:p>
         </w:tc>
@@ -2646,7 +2734,9 @@
             <w:pPr>
               <w:jc w:val="center"/>
             </w:pPr>
-            <w:r/>
+            <w:r>
+              <w:t>Infer. (s)</w:t>
+            </w:r>
             <w:r>
               <w:rPr>
                 <w:rFonts w:ascii="Arial" w:hAnsi="Arial"/>
@@ -2654,7 +2744,6 @@
                 <w:color w:val="FFFFFF"/>
                 <w:sz w:val="13"/>
               </w:rPr>
-              <w:t>Infer. (s)</w:t>
             </w:r>
           </w:p>
         </w:tc>
@@ -2668,7 +2757,9 @@
             <w:pPr>
               <w:jc w:val="center"/>
             </w:pPr>
-            <w:r/>
+            <w:r>
+              <w:t>MB</w:t>
+            </w:r>
             <w:r>
               <w:rPr>
                 <w:rFonts w:ascii="Arial" w:hAnsi="Arial"/>
@@ -2676,7 +2767,6 @@
                 <w:color w:val="FFFFFF"/>
                 <w:sz w:val="13"/>
               </w:rPr>
-              <w:t>MB</w:t>
             </w:r>
           </w:p>
         </w:tc>
@@ -2691,14 +2781,15 @@
             <w:pPr>
               <w:jc w:val="left"/>
             </w:pPr>
-            <w:r/>
+            <w:r>
+              <w:t>MLP-TFIDF</w:t>
+            </w:r>
             <w:r>
               <w:rPr>
                 <w:rFonts w:ascii="Arial" w:hAnsi="Arial"/>
                 <w:b w:val="0"/>
                 <w:sz w:val="13"/>
               </w:rPr>
-              <w:t>MLP-TFIDF</w:t>
             </w:r>
           </w:p>
         </w:tc>
@@ -2711,14 +2802,15 @@
             <w:pPr>
               <w:jc w:val="center"/>
             </w:pPr>
-            <w:r/>
+            <w:r>
+              <w:t>0.6427</w:t>
+            </w:r>
             <w:r>
               <w:rPr>
                 <w:rFonts w:ascii="Arial" w:hAnsi="Arial"/>
                 <w:b w:val="0"/>
                 <w:sz w:val="13"/>
               </w:rPr>
-              <w:t>0.6427</w:t>
             </w:r>
           </w:p>
         </w:tc>
@@ -2731,14 +2823,15 @@
             <w:pPr>
               <w:jc w:val="center"/>
             </w:pPr>
-            <w:r/>
+            <w:r>
+              <w:t>0.6219</w:t>
+            </w:r>
             <w:r>
               <w:rPr>
                 <w:rFonts w:ascii="Arial" w:hAnsi="Arial"/>
                 <w:b w:val="0"/>
                 <w:sz w:val="13"/>
               </w:rPr>
-              <w:t>0.6219</w:t>
             </w:r>
           </w:p>
         </w:tc>
@@ -2751,14 +2844,15 @@
             <w:pPr>
               <w:jc w:val="center"/>
             </w:pPr>
-            <w:r/>
+            <w:r>
+              <w:t>0.8896</w:t>
+            </w:r>
             <w:r>
               <w:rPr>
                 <w:rFonts w:ascii="Arial" w:hAnsi="Arial"/>
                 <w:b w:val="0"/>
                 <w:sz w:val="13"/>
               </w:rPr>
-              <w:t>0.8896</w:t>
             </w:r>
           </w:p>
         </w:tc>
@@ -2771,14 +2865,15 @@
             <w:pPr>
               <w:jc w:val="center"/>
             </w:pPr>
-            <w:r/>
+            <w:r>
+              <w:t>1.56</w:t>
+            </w:r>
             <w:r>
               <w:rPr>
                 <w:rFonts w:ascii="Arial" w:hAnsi="Arial"/>
                 <w:b w:val="0"/>
                 <w:sz w:val="13"/>
               </w:rPr>
-              <w:t>1.59</w:t>
             </w:r>
           </w:p>
         </w:tc>
@@ -2791,14 +2886,15 @@
             <w:pPr>
               <w:jc w:val="center"/>
             </w:pPr>
-            <w:r/>
+            <w:r>
+              <w:t>0.057</w:t>
+            </w:r>
             <w:r>
               <w:rPr>
                 <w:rFonts w:ascii="Arial" w:hAnsi="Arial"/>
                 <w:b w:val="0"/>
                 <w:sz w:val="13"/>
               </w:rPr>
-              <w:t>0.077</w:t>
             </w:r>
           </w:p>
         </w:tc>
@@ -2811,14 +2907,15 @@
             <w:pPr>
               <w:jc w:val="center"/>
             </w:pPr>
-            <w:r/>
+            <w:r>
+              <w:t>1.26</w:t>
+            </w:r>
             <w:r>
               <w:rPr>
                 <w:rFonts w:ascii="Arial" w:hAnsi="Arial"/>
                 <w:b w:val="0"/>
                 <w:sz w:val="13"/>
               </w:rPr>
-              <w:t>1.26</w:t>
             </w:r>
           </w:p>
         </w:tc>
@@ -2834,14 +2931,15 @@
             <w:pPr>
               <w:jc w:val="left"/>
             </w:pPr>
-            <w:r/>
+            <w:r>
+              <w:t>CNN-1D</w:t>
+            </w:r>
             <w:r>
               <w:rPr>
                 <w:rFonts w:ascii="Arial" w:hAnsi="Arial"/>
                 <w:b w:val="0"/>
                 <w:sz w:val="13"/>
               </w:rPr>
-              <w:t>CNN-1D</w:t>
             </w:r>
           </w:p>
         </w:tc>
@@ -2855,14 +2953,15 @@
             <w:pPr>
               <w:jc w:val="center"/>
             </w:pPr>
-            <w:r/>
+            <w:r>
+              <w:t>0.6488</w:t>
+            </w:r>
             <w:r>
               <w:rPr>
                 <w:rFonts w:ascii="Arial" w:hAnsi="Arial"/>
                 <w:b w:val="0"/>
                 <w:sz w:val="13"/>
               </w:rPr>
-              <w:t>0.6488</w:t>
             </w:r>
           </w:p>
         </w:tc>
@@ -2876,14 +2975,15 @@
             <w:pPr>
               <w:jc w:val="center"/>
             </w:pPr>
-            <w:r/>
+            <w:r>
+              <w:t>0.5979</w:t>
+            </w:r>
             <w:r>
               <w:rPr>
                 <w:rFonts w:ascii="Arial" w:hAnsi="Arial"/>
                 <w:b w:val="0"/>
                 <w:sz w:val="13"/>
               </w:rPr>
-              <w:t>0.5977</w:t>
             </w:r>
           </w:p>
         </w:tc>
@@ -2897,14 +2997,15 @@
             <w:pPr>
               <w:jc w:val="center"/>
             </w:pPr>
-            <w:r/>
+            <w:r>
+              <w:t>0.8738</w:t>
+            </w:r>
             <w:r>
               <w:rPr>
                 <w:rFonts w:ascii="Arial" w:hAnsi="Arial"/>
                 <w:b w:val="0"/>
                 <w:sz w:val="13"/>
               </w:rPr>
-              <w:t>0.8737</w:t>
             </w:r>
           </w:p>
         </w:tc>
@@ -2918,14 +3019,15 @@
             <w:pPr>
               <w:jc w:val="center"/>
             </w:pPr>
-            <w:r/>
+            <w:r>
+              <w:t>3.11</w:t>
+            </w:r>
             <w:r>
               <w:rPr>
                 <w:rFonts w:ascii="Arial" w:hAnsi="Arial"/>
                 <w:b w:val="0"/>
                 <w:sz w:val="13"/>
               </w:rPr>
-              <w:t>2.70</w:t>
             </w:r>
           </w:p>
         </w:tc>
@@ -2939,14 +3041,15 @@
             <w:pPr>
               <w:jc w:val="center"/>
             </w:pPr>
-            <w:r/>
+            <w:r>
+              <w:t>0.148</w:t>
+            </w:r>
             <w:r>
               <w:rPr>
                 <w:rFonts w:ascii="Arial" w:hAnsi="Arial"/>
                 <w:b w:val="0"/>
                 <w:sz w:val="13"/>
               </w:rPr>
-              <w:t>0.098</w:t>
             </w:r>
           </w:p>
         </w:tc>
@@ -2960,14 +3063,15 @@
             <w:pPr>
               <w:jc w:val="center"/>
             </w:pPr>
-            <w:r/>
+            <w:r>
+              <w:t>1.38</w:t>
+            </w:r>
             <w:r>
               <w:rPr>
                 <w:rFonts w:ascii="Arial" w:hAnsi="Arial"/>
                 <w:b w:val="0"/>
                 <w:sz w:val="13"/>
               </w:rPr>
-              <w:t>1.38</w:t>
             </w:r>
           </w:p>
         </w:tc>
@@ -2982,14 +3086,15 @@
             <w:pPr>
               <w:jc w:val="left"/>
             </w:pPr>
-            <w:r/>
+            <w:r>
+              <w:t>BiLSTM</w:t>
+            </w:r>
             <w:r>
               <w:rPr>
                 <w:rFonts w:ascii="Arial" w:hAnsi="Arial"/>
                 <w:b w:val="0"/>
                 <w:sz w:val="13"/>
               </w:rPr>
-              <w:t>BiLSTM-Atencion</w:t>
             </w:r>
           </w:p>
         </w:tc>
@@ -3002,14 +3107,15 @@
             <w:pPr>
               <w:jc w:val="center"/>
             </w:pPr>
-            <w:r/>
+            <w:r>
+              <w:t>0.6184</w:t>
+            </w:r>
             <w:r>
               <w:rPr>
                 <w:rFonts w:ascii="Arial" w:hAnsi="Arial"/>
                 <w:b w:val="0"/>
                 <w:sz w:val="13"/>
               </w:rPr>
-              <w:t>0.5822</w:t>
             </w:r>
           </w:p>
         </w:tc>
@@ -3022,14 +3128,15 @@
             <w:pPr>
               <w:jc w:val="center"/>
             </w:pPr>
-            <w:r/>
+            <w:r>
+              <w:t>0.5892</w:t>
+            </w:r>
             <w:r>
               <w:rPr>
                 <w:rFonts w:ascii="Arial" w:hAnsi="Arial"/>
                 <w:b w:val="0"/>
                 <w:sz w:val="13"/>
               </w:rPr>
-              <w:t>0.5801</w:t>
             </w:r>
           </w:p>
         </w:tc>
@@ -3042,14 +3149,15 @@
             <w:pPr>
               <w:jc w:val="center"/>
             </w:pPr>
-            <w:r/>
+            <w:r>
+              <w:t>0.8633</w:t>
+            </w:r>
             <w:r>
               <w:rPr>
                 <w:rFonts w:ascii="Arial" w:hAnsi="Arial"/>
                 <w:b w:val="0"/>
                 <w:sz w:val="13"/>
               </w:rPr>
-              <w:t>0.8769</w:t>
             </w:r>
           </w:p>
         </w:tc>
@@ -3062,14 +3170,15 @@
             <w:pPr>
               <w:jc w:val="center"/>
             </w:pPr>
-            <w:r/>
+            <w:r>
+              <w:t>8.27</w:t>
+            </w:r>
             <w:r>
               <w:rPr>
                 <w:rFonts w:ascii="Arial" w:hAnsi="Arial"/>
                 <w:b w:val="0"/>
                 <w:sz w:val="13"/>
               </w:rPr>
-              <w:t>19.70</w:t>
             </w:r>
           </w:p>
         </w:tc>
@@ -3082,14 +3191,15 @@
             <w:pPr>
               <w:jc w:val="center"/>
             </w:pPr>
-            <w:r/>
+            <w:r>
+              <w:t>0.559</w:t>
+            </w:r>
             <w:r>
               <w:rPr>
                 <w:rFonts w:ascii="Arial" w:hAnsi="Arial"/>
                 <w:b w:val="0"/>
                 <w:sz w:val="13"/>
               </w:rPr>
-              <w:t>0.664</w:t>
             </w:r>
           </w:p>
         </w:tc>
@@ -3102,14 +3212,15 @@
             <w:pPr>
               <w:jc w:val="center"/>
             </w:pPr>
-            <w:r/>
+            <w:r>
+              <w:t>1.47</w:t>
+            </w:r>
             <w:r>
               <w:rPr>
                 <w:rFonts w:ascii="Arial" w:hAnsi="Arial"/>
                 <w:b w:val="0"/>
                 <w:sz w:val="13"/>
               </w:rPr>
-              <w:t>1.49</w:t>
             </w:r>
           </w:p>
         </w:tc>
@@ -3125,14 +3236,15 @@
             <w:pPr>
               <w:jc w:val="left"/>
             </w:pPr>
-            <w:r/>
+            <w:r>
+              <w:t>BiLSTM-Atención</w:t>
+            </w:r>
             <w:r>
               <w:rPr>
                 <w:rFonts w:ascii="Arial" w:hAnsi="Arial"/>
                 <w:b w:val="0"/>
                 <w:sz w:val="13"/>
               </w:rPr>
-              <w:t>CNN-BiLSTM</w:t>
             </w:r>
           </w:p>
         </w:tc>
@@ -3146,14 +3258,15 @@
             <w:pPr>
               <w:jc w:val="center"/>
             </w:pPr>
-            <w:r/>
+            <w:r>
+              <w:t>0.5866</w:t>
+            </w:r>
             <w:r>
               <w:rPr>
                 <w:rFonts w:ascii="Arial" w:hAnsi="Arial"/>
                 <w:b w:val="0"/>
                 <w:sz w:val="13"/>
               </w:rPr>
-              <w:t>0.5537</w:t>
             </w:r>
           </w:p>
         </w:tc>
@@ -3167,14 +3280,15 @@
             <w:pPr>
               <w:jc w:val="center"/>
             </w:pPr>
-            <w:r/>
+            <w:r>
+              <w:t>0.5817</w:t>
+            </w:r>
             <w:r>
               <w:rPr>
                 <w:rFonts w:ascii="Arial" w:hAnsi="Arial"/>
                 <w:b w:val="0"/>
                 <w:sz w:val="13"/>
               </w:rPr>
-              <w:t>0.5626</w:t>
             </w:r>
           </w:p>
         </w:tc>
@@ -3188,14 +3302,15 @@
             <w:pPr>
               <w:jc w:val="center"/>
             </w:pPr>
-            <w:r/>
+            <w:r>
+              <w:t>0.8734</w:t>
+            </w:r>
             <w:r>
               <w:rPr>
                 <w:rFonts w:ascii="Arial" w:hAnsi="Arial"/>
                 <w:b w:val="0"/>
                 <w:sz w:val="13"/>
               </w:rPr>
-              <w:t>0.8734</w:t>
             </w:r>
           </w:p>
         </w:tc>
@@ -3209,14 +3324,15 @@
             <w:pPr>
               <w:jc w:val="center"/>
             </w:pPr>
-            <w:r/>
+            <w:r>
+              <w:t>9.85</w:t>
+            </w:r>
             <w:r>
               <w:rPr>
                 <w:rFonts w:ascii="Arial" w:hAnsi="Arial"/>
                 <w:b w:val="0"/>
                 <w:sz w:val="13"/>
               </w:rPr>
-              <w:t>15.31</w:t>
             </w:r>
           </w:p>
         </w:tc>
@@ -3230,14 +3346,15 @@
             <w:pPr>
               <w:jc w:val="center"/>
             </w:pPr>
-            <w:r/>
+            <w:r>
+              <w:t>0.505</w:t>
+            </w:r>
             <w:r>
               <w:rPr>
                 <w:rFonts w:ascii="Arial" w:hAnsi="Arial"/>
                 <w:b w:val="0"/>
                 <w:sz w:val="13"/>
               </w:rPr>
-              <w:t>0.786</w:t>
             </w:r>
           </w:p>
         </w:tc>
@@ -3251,14 +3368,15 @@
             <w:pPr>
               <w:jc w:val="center"/>
             </w:pPr>
-            <w:r/>
+            <w:r>
+              <w:t>1.49</w:t>
+            </w:r>
             <w:r>
               <w:rPr>
                 <w:rFonts w:ascii="Arial" w:hAnsi="Arial"/>
                 <w:b w:val="0"/>
                 <w:sz w:val="13"/>
               </w:rPr>
-              <w:t>1.48</w:t>
             </w:r>
           </w:p>
         </w:tc>
@@ -3273,14 +3391,15 @@
             <w:pPr>
               <w:jc w:val="left"/>
             </w:pPr>
-            <w:r/>
+            <w:r>
+              <w:t>CNN-BiLSTM</w:t>
+            </w:r>
             <w:r>
               <w:rPr>
                 <w:rFonts w:ascii="Arial" w:hAnsi="Arial"/>
                 <w:b w:val="0"/>
                 <w:sz w:val="13"/>
               </w:rPr>
-              <w:t>LSTM</w:t>
             </w:r>
           </w:p>
         </w:tc>
@@ -3293,14 +3412,15 @@
             <w:pPr>
               <w:jc w:val="center"/>
             </w:pPr>
-            <w:r/>
+            <w:r>
+              <w:t>0.5271</w:t>
+            </w:r>
             <w:r>
               <w:rPr>
                 <w:rFonts w:ascii="Arial" w:hAnsi="Arial"/>
                 <w:b w:val="0"/>
                 <w:sz w:val="13"/>
               </w:rPr>
-              <w:t>0.5014</w:t>
             </w:r>
           </w:p>
         </w:tc>
@@ -3313,14 +3433,15 @@
             <w:pPr>
               <w:jc w:val="center"/>
             </w:pPr>
-            <w:r/>
+            <w:r>
+              <w:t>0.5561</w:t>
+            </w:r>
             <w:r>
               <w:rPr>
                 <w:rFonts w:ascii="Arial" w:hAnsi="Arial"/>
                 <w:b w:val="0"/>
                 <w:sz w:val="13"/>
               </w:rPr>
-              <w:t>0.2204</w:t>
             </w:r>
           </w:p>
         </w:tc>
@@ -3333,14 +3454,15 @@
             <w:pPr>
               <w:jc w:val="center"/>
             </w:pPr>
-            <w:r/>
+            <w:r>
+              <w:t>0.8722</w:t>
+            </w:r>
             <w:r>
               <w:rPr>
                 <w:rFonts w:ascii="Arial" w:hAnsi="Arial"/>
                 <w:b w:val="0"/>
                 <w:sz w:val="13"/>
               </w:rPr>
-              <w:t>0.6890</w:t>
             </w:r>
           </w:p>
         </w:tc>
@@ -3353,14 +3475,15 @@
             <w:pPr>
               <w:jc w:val="center"/>
             </w:pPr>
-            <w:r/>
+            <w:r>
+              <w:t>12.87</w:t>
+            </w:r>
             <w:r>
               <w:rPr>
                 <w:rFonts w:ascii="Arial" w:hAnsi="Arial"/>
                 <w:b w:val="0"/>
                 <w:sz w:val="13"/>
               </w:rPr>
-              <w:t>7.89</w:t>
             </w:r>
           </w:p>
         </w:tc>
@@ -3373,14 +3496,15 @@
             <w:pPr>
               <w:jc w:val="center"/>
             </w:pPr>
-            <w:r/>
+            <w:r>
+              <w:t>0.521</w:t>
+            </w:r>
             <w:r>
               <w:rPr>
                 <w:rFonts w:ascii="Arial" w:hAnsi="Arial"/>
                 <w:b w:val="0"/>
                 <w:sz w:val="13"/>
               </w:rPr>
-              <w:t>0.282</w:t>
             </w:r>
           </w:p>
         </w:tc>
@@ -3393,14 +3517,164 @@
             <w:pPr>
               <w:jc w:val="center"/>
             </w:pPr>
-            <w:r/>
+            <w:r>
+              <w:t>1.48</w:t>
+            </w:r>
             <w:r>
               <w:rPr>
                 <w:rFonts w:ascii="Arial" w:hAnsi="Arial"/>
                 <w:b w:val="0"/>
                 <w:sz w:val="13"/>
               </w:rPr>
+            </w:r>
+          </w:p>
+        </w:tc>
+      </w:tr>
+      <w:tr>
+        <w:tc>
+          <w:tcPr>
+            <w:tcW w:type="dxa" w:w="1400"/>
+            <w:vAlign w:val="center"/>
+          </w:tcPr>
+          <w:p>
+            <w:pPr>
+              <w:jc w:val="left"/>
+            </w:pPr>
+            <w:r>
+              <w:t>LSTM</w:t>
+            </w:r>
+            <w:r>
+              <w:rPr>
+                <w:rFonts w:ascii="Arial" w:hAnsi="Arial"/>
+                <w:b w:val="0"/>
+                <w:sz w:val="13"/>
+              </w:rPr>
+            </w:r>
+          </w:p>
+        </w:tc>
+        <w:tc>
+          <w:tcPr>
+            <w:tcW w:type="dxa" w:w="1400"/>
+            <w:vAlign w:val="center"/>
+          </w:tcPr>
+          <w:p>
+            <w:pPr>
+              <w:jc w:val="center"/>
+            </w:pPr>
+            <w:r>
+              <w:t>0.5014</w:t>
+            </w:r>
+            <w:r>
+              <w:rPr>
+                <w:rFonts w:ascii="Arial" w:hAnsi="Arial"/>
+                <w:b w:val="0"/>
+                <w:sz w:val="13"/>
+              </w:rPr>
+            </w:r>
+          </w:p>
+        </w:tc>
+        <w:tc>
+          <w:tcPr>
+            <w:tcW w:type="dxa" w:w="1400"/>
+            <w:vAlign w:val="center"/>
+          </w:tcPr>
+          <w:p>
+            <w:pPr>
+              <w:jc w:val="center"/>
+            </w:pPr>
+            <w:r>
+              <w:t>0.2204</w:t>
+            </w:r>
+            <w:r>
+              <w:rPr>
+                <w:rFonts w:ascii="Arial" w:hAnsi="Arial"/>
+                <w:b w:val="0"/>
+                <w:sz w:val="13"/>
+              </w:rPr>
+            </w:r>
+          </w:p>
+        </w:tc>
+        <w:tc>
+          <w:tcPr>
+            <w:tcW w:type="dxa" w:w="1400"/>
+            <w:vAlign w:val="center"/>
+          </w:tcPr>
+          <w:p>
+            <w:pPr>
+              <w:jc w:val="center"/>
+            </w:pPr>
+            <w:r>
+              <w:t>0.6890</w:t>
+            </w:r>
+            <w:r>
+              <w:rPr>
+                <w:rFonts w:ascii="Arial" w:hAnsi="Arial"/>
+                <w:b w:val="0"/>
+                <w:sz w:val="13"/>
+              </w:rPr>
+            </w:r>
+          </w:p>
+        </w:tc>
+        <w:tc>
+          <w:tcPr>
+            <w:tcW w:type="dxa" w:w="1400"/>
+            <w:vAlign w:val="center"/>
+          </w:tcPr>
+          <w:p>
+            <w:pPr>
+              <w:jc w:val="center"/>
+            </w:pPr>
+            <w:r>
+              <w:t>3.89</w:t>
+            </w:r>
+            <w:r>
+              <w:rPr>
+                <w:rFonts w:ascii="Arial" w:hAnsi="Arial"/>
+                <w:b w:val="0"/>
+                <w:sz w:val="13"/>
+              </w:rPr>
+            </w:r>
+          </w:p>
+        </w:tc>
+        <w:tc>
+          <w:tcPr>
+            <w:tcW w:type="dxa" w:w="1400"/>
+            <w:vAlign w:val="center"/>
+          </w:tcPr>
+          <w:p>
+            <w:pPr>
+              <w:jc w:val="center"/>
+            </w:pPr>
+            <w:r>
+              <w:t>0.224</w:t>
+            </w:r>
+            <w:r>
+              <w:rPr>
+                <w:rFonts w:ascii="Arial" w:hAnsi="Arial"/>
+                <w:b w:val="0"/>
+                <w:sz w:val="13"/>
+              </w:rPr>
+            </w:r>
+          </w:p>
+        </w:tc>
+        <w:tc>
+          <w:tcPr>
+            <w:tcW w:type="dxa" w:w="1400"/>
+            <w:vAlign w:val="center"/>
+          </w:tcPr>
+          <w:p>
+            <w:pPr>
+              <w:jc w:val="center"/>
+            </w:pPr>
+            <w:r>
               <w:t>1.40</w:t>
+            </w:r>
+            <w:r>
+              <w:rPr>
+                <w:rFonts w:ascii="Arial" w:hAnsi="Arial"/>
+                <w:b w:val="0"/>
+                <w:sz w:val="13"/>
+              </w:rPr>
             </w:r>
           </w:p>
         </w:tc>
@@ -3435,7 +3709,7 @@
         <w:drawing>
           <wp:inline xmlns:a="http://schemas.openxmlformats.org/drawingml/2006/main" xmlns:pic="http://schemas.openxmlformats.org/drawingml/2006/picture">
             <wp:extent cx="5623560" cy="3124200"/>
-            <wp:docPr id="6" name="Picture 6"/>
+            <wp:docPr id="32" name="Picture 32"/>
             <wp:cNvGraphicFramePr>
               <a:graphicFrameLocks noChangeAspect="1"/>
             </wp:cNvGraphicFramePr>
@@ -3447,7 +3721,7 @@
                     <pic:cNvPicPr/>
                   </pic:nvPicPr>
                   <pic:blipFill>
-                    <a:blip r:embed="rId16"/>
+                    <a:blip r:embed="rId40"/>
                     <a:stretch>
                       <a:fillRect/>
                     </a:stretch>
@@ -3478,7 +3752,7 @@
           <w:i/>
           <w:sz w:val="17"/>
         </w:rPr>
-        <w:t>Figura 6. Comparación de F1 macro de los cinco modelos.</w:t>
+        <w:t>Figura 6. Comparación de F1 macro de los seis modelos.</w:t>
       </w:r>
     </w:p>
     <w:p>
@@ -5921,7 +6195,7 @@
         <w:ind w:firstLine="425"/>
       </w:pPr>
       <w:r>
-        <w:t>CNN-1D fue el modelo más estable en validación cruzada y logró la mayor accuracy en prueba. Por tanto, aunque MLP-TFIDF fue seleccionado por F1 macro oficial, CNN-1D es una alternativa razonable cuando se prioriza estabilidad entre reuniones. Los modelos híbridos no superaron a los clásicos bajo la configuración de dos épocas. Su mayor complejidad incrementó el tiempo, sin garantizar mejor generalización.</w:t>
+        <w:t>CNN-1D fue el modelo más estable en validación cruzada y logró la mayor accuracy en prueba. Por tanto, aunque MLP-TFIDF fue seleccionado por F1 macro oficial, CNN-1D es una alternativa razonable cuando se prioriza estabilidad entre reuniones. BiLSTM quedó en tercer lugar de la comparación principal, con F1 macro de 0,5892. Las arquitecturas recurrentes más complejas incrementaron el tiempo sin garantizar mejor generalización bajo la configuración de dos épocas.</w:t>
       </w:r>
     </w:p>
     <w:p>
@@ -5931,7 +6205,7 @@
         <w:ind w:firstLine="425"/>
       </w:pPr>
       <w:r>
-        <w:t>El desempeño de las clases de retroalimentación y seguimiento sugiere que una intervención aislada no siempre contiene suficiente información. Como MRDA es conversacional, incorporar contexto de turnos anteriores, información del hablante o modelos preentrenados podría elevar el rendimiento. No obstante, el objetivo docente se centró en comparar modelos clásicos e híbridos entrenados por el equipo, requisito que se cumplió sin utilizar resultados simulados.</w:t>
+        <w:t>El desempeño de las clases de retroalimentación y seguimiento sugiere que una intervención aislada no siempre contiene suficiente información. Como MRDA es conversacional, incorporar contexto de turnos anteriores, información del hablante o modelos preentrenados podría elevar el rendimiento. No obstante, el objetivo docente se centró en comparar modelos base e híbridos entrenados por el equipo, requisito que se cumplió sin utilizar resultados simulados.</w:t>
       </w:r>
     </w:p>
     <w:p>
@@ -5968,7 +6242,7 @@
         <w:spacing w:after="40"/>
       </w:pPr>
       <w:r>
-        <w:t>Se implementaron tres modelos clásicos y dos híbridos. MLP-TFIDF obtuvo el mejor F1 macro en prueba (0,6219), mientras CNN-1D presentó la mejor estabilidad en validación cruzada.</w:t>
+        <w:t>Se implementaron tres modelos base y tres híbridos. MLP-TFIDF obtuvo el mejor F1 macro en prueba (0,6219), mientras CNN-1D presentó la mejor estabilidad en la validación cruzada de cinco modelos.</w:t>
       </w:r>
     </w:p>
     <w:p>
@@ -6189,7 +6463,7 @@
         <w:keepNext/>
       </w:pPr>
       <w:r>
-        <w:t>Anexo A. Matrices de confusión de los cinco modelos</w:t>
+        <w:t>Anexo A. Matrices de confusión de los seis modelos</w:t>
       </w:r>
     </w:p>
     <w:p>
@@ -6469,11 +6743,65 @@
     </w:p>
     <w:p>
       <w:pPr>
+        <w:jc w:val="center"/>
+      </w:pPr>
+      <w:r>
+        <w:drawing>
+          <wp:inline xmlns:a="http://schemas.openxmlformats.org/drawingml/2006/main" xmlns:pic="http://schemas.openxmlformats.org/drawingml/2006/picture">
+            <wp:extent cx="4983480" cy="4271554"/>
+            <wp:docPr id="33" name="Picture 33"/>
+            <wp:cNvGraphicFramePr>
+              <a:graphicFrameLocks noChangeAspect="1"/>
+            </wp:cNvGraphicFramePr>
+            <a:graphic>
+              <a:graphicData uri="http://schemas.openxmlformats.org/drawingml/2006/picture">
+                <pic:pic>
+                  <pic:nvPicPr>
+                    <pic:cNvPr id="0" name="confusion_bilstm.png"/>
+                    <pic:cNvPicPr/>
+                  </pic:nvPicPr>
+                  <pic:blipFill>
+                    <a:blip r:embed="rId41"/>
+                    <a:stretch>
+                      <a:fillRect/>
+                    </a:stretch>
+                  </pic:blipFill>
+                  <pic:spPr>
+                    <a:xfrm>
+                      <a:off x="0" y="0"/>
+                      <a:ext cx="4983480" cy="4271554"/>
+                    </a:xfrm>
+                    <a:prstGeom prst="rect"/>
+                  </pic:spPr>
+                </pic:pic>
+              </a:graphicData>
+            </a:graphic>
+          </wp:inline>
+        </w:drawing>
+      </w:r>
+    </w:p>
+    <w:p>
+      <w:pPr>
+        <w:keepNext w:val="0"/>
+        <w:spacing w:before="40" w:after="140"/>
+        <w:jc w:val="center"/>
+      </w:pPr>
+      <w:r>
+        <w:rPr>
+          <w:rFonts w:ascii="Arial" w:hAnsi="Arial"/>
+          <w:i/>
+          <w:sz w:val="17"/>
+        </w:rPr>
+        <w:t>Figura A6. Matriz de confusión BiLSTM.</w:t>
+      </w:r>
+    </w:p>
+    <w:p>
+      <w:pPr>
         <w:pStyle w:val="Heading1"/>
         <w:keepNext/>
       </w:pPr>
       <w:r>
-        <w:t>Anexo B. Curvas ROC de los cinco modelos</w:t>
+        <w:t>Anexo B. Curvas ROC de los seis modelos</w:t>
       </w:r>
     </w:p>
     <w:p>
@@ -6753,6 +7081,60 @@
     </w:p>
     <w:p>
       <w:pPr>
+        <w:jc w:val="center"/>
+      </w:pPr>
+      <w:r>
+        <w:drawing>
+          <wp:inline xmlns:a="http://schemas.openxmlformats.org/drawingml/2006/main" xmlns:pic="http://schemas.openxmlformats.org/drawingml/2006/picture">
+            <wp:extent cx="4983480" cy="3737610"/>
+            <wp:docPr id="34" name="Picture 34"/>
+            <wp:cNvGraphicFramePr>
+              <a:graphicFrameLocks noChangeAspect="1"/>
+            </wp:cNvGraphicFramePr>
+            <a:graphic>
+              <a:graphicData uri="http://schemas.openxmlformats.org/drawingml/2006/picture">
+                <pic:pic>
+                  <pic:nvPicPr>
+                    <pic:cNvPr id="0" name="roc_bilstm.png"/>
+                    <pic:cNvPicPr/>
+                  </pic:nvPicPr>
+                  <pic:blipFill>
+                    <a:blip r:embed="rId42"/>
+                    <a:stretch>
+                      <a:fillRect/>
+                    </a:stretch>
+                  </pic:blipFill>
+                  <pic:spPr>
+                    <a:xfrm>
+                      <a:off x="0" y="0"/>
+                      <a:ext cx="4983480" cy="3737610"/>
+                    </a:xfrm>
+                    <a:prstGeom prst="rect"/>
+                  </pic:spPr>
+                </pic:pic>
+              </a:graphicData>
+            </a:graphic>
+          </wp:inline>
+        </w:drawing>
+      </w:r>
+    </w:p>
+    <w:p>
+      <w:pPr>
+        <w:keepNext w:val="0"/>
+        <w:spacing w:before="40" w:after="140"/>
+        <w:jc w:val="center"/>
+      </w:pPr>
+      <w:r>
+        <w:rPr>
+          <w:rFonts w:ascii="Arial" w:hAnsi="Arial"/>
+          <w:i/>
+          <w:sz w:val="17"/>
+        </w:rPr>
+        <w:t>Figura B6. Curva ROC BiLSTM.</w:t>
+      </w:r>
+    </w:p>
+    <w:p>
+      <w:pPr>
         <w:pStyle w:val="Heading1"/>
         <w:keepNext/>
       </w:pPr>
@@ -7037,6 +7419,60 @@
     </w:p>
     <w:p>
       <w:pPr>
+        <w:jc w:val="center"/>
+      </w:pPr>
+      <w:r>
+        <w:drawing>
+          <wp:inline xmlns:a="http://schemas.openxmlformats.org/drawingml/2006/main" xmlns:pic="http://schemas.openxmlformats.org/drawingml/2006/picture">
+            <wp:extent cx="5074920" cy="3171825"/>
+            <wp:docPr id="35" name="Picture 35"/>
+            <wp:cNvGraphicFramePr>
+              <a:graphicFrameLocks noChangeAspect="1"/>
+            </wp:cNvGraphicFramePr>
+            <a:graphic>
+              <a:graphicData uri="http://schemas.openxmlformats.org/drawingml/2006/picture">
+                <pic:pic>
+                  <pic:nvPicPr>
+                    <pic:cNvPr id="0" name="loss_bilstm.png"/>
+                    <pic:cNvPicPr/>
+                  </pic:nvPicPr>
+                  <pic:blipFill>
+                    <a:blip r:embed="rId43"/>
+                    <a:stretch>
+                      <a:fillRect/>
+                    </a:stretch>
+                  </pic:blipFill>
+                  <pic:spPr>
+                    <a:xfrm>
+                      <a:off x="0" y="0"/>
+                      <a:ext cx="5074920" cy="3171825"/>
+                    </a:xfrm>
+                    <a:prstGeom prst="rect"/>
+                  </pic:spPr>
+                </pic:pic>
+              </a:graphicData>
+            </a:graphic>
+          </wp:inline>
+        </w:drawing>
+      </w:r>
+    </w:p>
+    <w:p>
+      <w:pPr>
+        <w:keepNext w:val="0"/>
+        <w:spacing w:before="40" w:after="140"/>
+        <w:jc w:val="center"/>
+      </w:pPr>
+      <w:r>
+        <w:rPr>
+          <w:rFonts w:ascii="Arial" w:hAnsi="Arial"/>
+          <w:i/>
+          <w:sz w:val="17"/>
+        </w:rPr>
+        <w:t>Figura C6. Curva de pérdida BiLSTM.</w:t>
+      </w:r>
+    </w:p>
+    <w:p>
+      <w:pPr>
         <w:pStyle w:val="Heading1"/>
         <w:keepNext/>
       </w:pPr>
@@ -7264,14 +7700,15 @@
             <w:pPr>
               <w:jc w:val="left"/>
             </w:pPr>
-            <w:r/>
+            <w:r>
+              <w:t>3 modelos base</w:t>
+            </w:r>
             <w:r>
               <w:rPr>
                 <w:rFonts w:ascii="Arial" w:hAnsi="Arial"/>
                 <w:b w:val="0"/>
                 <w:sz w:val="14"/>
               </w:rPr>
-              <w:t>3 modelos clásicos</w:t>
             </w:r>
           </w:p>
         </w:tc>
@@ -7304,14 +7741,144 @@
             <w:pPr>
               <w:jc w:val="center"/>
             </w:pPr>
-            <w:r/>
+            <w:r>
+              <w:t>CNN-1D, LSTM, BiLSTM</w:t>
+            </w:r>
             <w:r>
               <w:rPr>
                 <w:rFonts w:ascii="Arial" w:hAnsi="Arial"/>
                 <w:b w:val="0"/>
                 <w:sz w:val="14"/>
               </w:rPr>
-              <w:t>MLP-TFIDF, CNN-1D, LSTM</w:t>
+            </w:r>
+          </w:p>
+        </w:tc>
+      </w:tr>
+      <w:tr>
+        <w:tc>
+          <w:tcPr>
+            <w:tcW w:type="dxa" w:w="3267"/>
+            <w:vAlign w:val="center"/>
+            <w:shd w:fill="F2F2F2"/>
+          </w:tcPr>
+          <w:p>
+            <w:pPr>
+              <w:jc w:val="left"/>
+            </w:pPr>
+            <w:r>
+              <w:t>3 modelos híbridos</w:t>
+            </w:r>
+            <w:r>
+              <w:rPr>
+                <w:rFonts w:ascii="Arial" w:hAnsi="Arial"/>
+                <w:b w:val="0"/>
+                <w:sz w:val="14"/>
+              </w:rPr>
+            </w:r>
+          </w:p>
+        </w:tc>
+        <w:tc>
+          <w:tcPr>
+            <w:tcW w:type="dxa" w:w="3267"/>
+            <w:vAlign w:val="center"/>
+            <w:shd w:fill="F2F2F2"/>
+          </w:tcPr>
+          <w:p>
+            <w:pPr>
+              <w:jc w:val="center"/>
+            </w:pPr>
+            <w:r/>
+            <w:r>
+              <w:rPr>
+                <w:rFonts w:ascii="Arial" w:hAnsi="Arial"/>
+                <w:b w:val="0"/>
+                <w:sz w:val="14"/>
+              </w:rPr>
+              <w:t>Sí</w:t>
+            </w:r>
+          </w:p>
+        </w:tc>
+        <w:tc>
+          <w:tcPr>
+            <w:tcW w:type="dxa" w:w="3267"/>
+            <w:vAlign w:val="center"/>
+            <w:shd w:fill="F2F2F2"/>
+          </w:tcPr>
+          <w:p>
+            <w:pPr>
+              <w:jc w:val="center"/>
+            </w:pPr>
+            <w:r>
+              <w:t>MLP-TFIDF, CNN-BiLSTM, BiLSTM-Atención</w:t>
+            </w:r>
+            <w:r>
+              <w:rPr>
+                <w:rFonts w:ascii="Arial" w:hAnsi="Arial"/>
+                <w:b w:val="0"/>
+                <w:sz w:val="14"/>
+              </w:rPr>
+            </w:r>
+          </w:p>
+        </w:tc>
+      </w:tr>
+      <w:tr>
+        <w:tc>
+          <w:tcPr>
+            <w:tcW w:type="dxa" w:w="3267"/>
+            <w:vAlign w:val="center"/>
+          </w:tcPr>
+          <w:p>
+            <w:pPr>
+              <w:jc w:val="left"/>
+            </w:pPr>
+            <w:r/>
+            <w:r>
+              <w:rPr>
+                <w:rFonts w:ascii="Arial" w:hAnsi="Arial"/>
+                <w:b w:val="0"/>
+                <w:sz w:val="14"/>
+              </w:rPr>
+              <w:t>Tablas comparativas</w:t>
+            </w:r>
+          </w:p>
+        </w:tc>
+        <w:tc>
+          <w:tcPr>
+            <w:tcW w:type="dxa" w:w="3267"/>
+            <w:vAlign w:val="center"/>
+          </w:tcPr>
+          <w:p>
+            <w:pPr>
+              <w:jc w:val="center"/>
+            </w:pPr>
+            <w:r/>
+            <w:r>
+              <w:rPr>
+                <w:rFonts w:ascii="Arial" w:hAnsi="Arial"/>
+                <w:b w:val="0"/>
+                <w:sz w:val="14"/>
+              </w:rPr>
+              <w:t>Sí</w:t>
+            </w:r>
+          </w:p>
+        </w:tc>
+        <w:tc>
+          <w:tcPr>
+            <w:tcW w:type="dxa" w:w="3267"/>
+            <w:vAlign w:val="center"/>
+          </w:tcPr>
+          <w:p>
+            <w:pPr>
+              <w:jc w:val="center"/>
+            </w:pPr>
+            <w:r/>
+            <w:r>
+              <w:rPr>
+                <w:rFonts w:ascii="Arial" w:hAnsi="Arial"/>
+                <w:b w:val="0"/>
+                <w:sz w:val="14"/>
+              </w:rPr>
+              <w:t>Métricas, tiempo, inferencia, tamaño y parámetros</w:t>
             </w:r>
           </w:p>
         </w:tc>
@@ -7334,7 +7901,7 @@
                 <w:b w:val="0"/>
                 <w:sz w:val="14"/>
               </w:rPr>
-              <w:t>2 modelos híbridos</w:t>
+              <w:t>Matriz de confusión</w:t>
             </w:r>
           </w:p>
         </w:tc>
@@ -7369,14 +7936,15 @@
             <w:pPr>
               <w:jc w:val="center"/>
             </w:pPr>
-            <w:r/>
+            <w:r>
+              <w:t>Seis matrices</w:t>
+            </w:r>
             <w:r>
               <w:rPr>
                 <w:rFonts w:ascii="Arial" w:hAnsi="Arial"/>
                 <w:b w:val="0"/>
                 <w:sz w:val="14"/>
               </w:rPr>
-              <w:t>CNN-BiLSTM, BiLSTM-Atención</w:t>
             </w:r>
           </w:p>
         </w:tc>
@@ -7398,7 +7966,7 @@
                 <w:b w:val="0"/>
                 <w:sz w:val="14"/>
               </w:rPr>
-              <w:t>Tablas comparativas</w:t>
+              <w:t>Mapa de calor</w:t>
             </w:r>
           </w:p>
         </w:tc>
@@ -7438,7 +8006,7 @@
                 <w:b w:val="0"/>
                 <w:sz w:val="14"/>
               </w:rPr>
-              <w:t>Métricas, tiempo, inferencia, tamaño y parámetros</w:t>
+              <w:t>Clases por partición</w:t>
             </w:r>
           </w:p>
         </w:tc>
@@ -7461,7 +8029,7 @@
                 <w:b w:val="0"/>
                 <w:sz w:val="14"/>
               </w:rPr>
-              <w:t>Matriz de confusión</w:t>
+              <w:t>Curva ROC</w:t>
             </w:r>
           </w:p>
         </w:tc>
@@ -7496,141 +8064,15 @@
             <w:pPr>
               <w:jc w:val="center"/>
             </w:pPr>
-            <w:r/>
+            <w:r>
+              <w:t>Seis gráficos multiclase</w:t>
+            </w:r>
             <w:r>
               <w:rPr>
                 <w:rFonts w:ascii="Arial" w:hAnsi="Arial"/>
                 <w:b w:val="0"/>
                 <w:sz w:val="14"/>
               </w:rPr>
-              <w:t>Cinco matrices</w:t>
-            </w:r>
-          </w:p>
-        </w:tc>
-      </w:tr>
-      <w:tr>
-        <w:tc>
-          <w:tcPr>
-            <w:tcW w:type="dxa" w:w="3267"/>
-            <w:vAlign w:val="center"/>
-          </w:tcPr>
-          <w:p>
-            <w:pPr>
-              <w:jc w:val="left"/>
-            </w:pPr>
-            <w:r/>
-            <w:r>
-              <w:rPr>
-                <w:rFonts w:ascii="Arial" w:hAnsi="Arial"/>
-                <w:b w:val="0"/>
-                <w:sz w:val="14"/>
-              </w:rPr>
-              <w:t>Mapa de calor</w:t>
-            </w:r>
-          </w:p>
-        </w:tc>
-        <w:tc>
-          <w:tcPr>
-            <w:tcW w:type="dxa" w:w="3267"/>
-            <w:vAlign w:val="center"/>
-          </w:tcPr>
-          <w:p>
-            <w:pPr>
-              <w:jc w:val="center"/>
-            </w:pPr>
-            <w:r/>
-            <w:r>
-              <w:rPr>
-                <w:rFonts w:ascii="Arial" w:hAnsi="Arial"/>
-                <w:b w:val="0"/>
-                <w:sz w:val="14"/>
-              </w:rPr>
-              <w:t>Sí</w:t>
-            </w:r>
-          </w:p>
-        </w:tc>
-        <w:tc>
-          <w:tcPr>
-            <w:tcW w:type="dxa" w:w="3267"/>
-            <w:vAlign w:val="center"/>
-          </w:tcPr>
-          <w:p>
-            <w:pPr>
-              <w:jc w:val="center"/>
-            </w:pPr>
-            <w:r/>
-            <w:r>
-              <w:rPr>
-                <w:rFonts w:ascii="Arial" w:hAnsi="Arial"/>
-                <w:b w:val="0"/>
-                <w:sz w:val="14"/>
-              </w:rPr>
-              <w:t>Clases por partición</w:t>
-            </w:r>
-          </w:p>
-        </w:tc>
-      </w:tr>
-      <w:tr>
-        <w:tc>
-          <w:tcPr>
-            <w:tcW w:type="dxa" w:w="3267"/>
-            <w:vAlign w:val="center"/>
-            <w:shd w:fill="F2F2F2"/>
-          </w:tcPr>
-          <w:p>
-            <w:pPr>
-              <w:jc w:val="left"/>
-            </w:pPr>
-            <w:r/>
-            <w:r>
-              <w:rPr>
-                <w:rFonts w:ascii="Arial" w:hAnsi="Arial"/>
-                <w:b w:val="0"/>
-                <w:sz w:val="14"/>
-              </w:rPr>
-              <w:t>Curva ROC</w:t>
-            </w:r>
-          </w:p>
-        </w:tc>
-        <w:tc>
-          <w:tcPr>
-            <w:tcW w:type="dxa" w:w="3267"/>
-            <w:vAlign w:val="center"/>
-            <w:shd w:fill="F2F2F2"/>
-          </w:tcPr>
-          <w:p>
-            <w:pPr>
-              <w:jc w:val="center"/>
-            </w:pPr>
-            <w:r/>
-            <w:r>
-              <w:rPr>
-                <w:rFonts w:ascii="Arial" w:hAnsi="Arial"/>
-                <w:b w:val="0"/>
-                <w:sz w:val="14"/>
-              </w:rPr>
-              <w:t>Sí</w:t>
-            </w:r>
-          </w:p>
-        </w:tc>
-        <w:tc>
-          <w:tcPr>
-            <w:tcW w:type="dxa" w:w="3267"/>
-            <w:vAlign w:val="center"/>
-            <w:shd w:fill="F2F2F2"/>
-          </w:tcPr>
-          <w:p>
-            <w:pPr>
-              <w:jc w:val="center"/>
-            </w:pPr>
-            <w:r/>
-            <w:r>
-              <w:rPr>
-                <w:rFonts w:ascii="Arial" w:hAnsi="Arial"/>
-                <w:b w:val="0"/>
-                <w:sz w:val="14"/>
-              </w:rPr>
-              <w:t>Cinco gráficos multiclase</w:t>
             </w:r>
           </w:p>
         </w:tc>
@@ -8587,7 +9029,7 @@
           <w:i/>
           <w:sz w:val="17"/>
         </w:rPr>
-        <w:t>Figura F3. Comparación de los cinco modelos en Streamlit.</w:t>
+        <w:t>Figura F3. Comparación de los seis modelos en Streamlit.</w:t>
       </w:r>
     </w:p>
     <w:p>

</xml_diff>